<commit_message>
Update Strategic Brief with LLM-evaluated response quality data (March 2026)
- Table 3 expanded from 3 rows to 7: full quality breakdown by tag
  CORRECT 341 (70%), NO SOLUTION 73 (15%), GENERIC TEMPLATE 50 (10.3%),
  WRONG ISSUE 11 (2.3%), NO EMPATHY 6 (1.2%), HI-RATING+APOLOGY 5 (1.0%),
  UNWARRANTED APOLOGY 1 (0.2%)
- Executive Summary updated: 30% quality-issue rate vs old 51.5% redirect-only
- GENERIC-REPLY-PATTERN fix item updated with new accurate percentages
- Success Metrics: "% Correct" now shows 70.0% (LLM-evaluated baseline)
- Table 3 caption now references LLM methodology and n=487

Co-Authored-By: Claude Sonnet 4.6 <noreply@anthropic.com>
</commit_message>
<xml_diff>
--- a/McAfee_Customer_Support_Strategic_Brief_Updated.docx
+++ b/McAfee_Customer_Support_Strategic_Brief_Updated.docx
@@ -312,7 +312,7 @@
     </w:p>
     <w:p>
       <w:r>
-        <w:t>With McAfee's new app launch imminent, the window to shape first impressions is narrowing fast. Prospective users routinely check app store reviews before committing to a purchase. What they find today on the Google Play Store is a wall of unresolved negative experiences: 71 one-star reviews (14.2% of all Play Store reviews), many of which receive responses that redirect users to a support URL rather than solve the problem.</w:t>
+        <w:t>With McAfee’s new app launch imminent, the window to shape first impressions is narrowing fast. Prospective users routinely check app store reviews before committing to a purchase. What they find today on the Google Play Store is a wall of unresolved negative experiences: 71 one-star reviews (14.2% of all Play Store reviews), many of which receive responses that show empathy but stop short of offering the customer a single actionable next step. An LLM-based evaluation of all 487 developer replies found that 30% carry quality issues — the largest being “No Solution” (empathy without action) at 15.0% and “Generic Template” (copy-paste boilerplate) at 10.3%.</w:t>
       </w:r>
     </w:p>
     <w:p>
@@ -1526,43 +1526,43 @@
                 <w:color w:val="1A1A1A"/>
                 <w:sz w:val="20"/>
               </w:rPr>
-              <w:t>Redirect-only acknowledges, then sends to a URL with no in-reply help</w:t>
-            </w:r>
-          </w:p>
-        </w:tc>
-        <w:tc>
-          <w:tcPr>
-            <w:vAlign w:val="center"/>
-          </w:tcPr>
-          <w:p>
-            <w:pPr>
-              <w:spacing w:before="0" w:after="0"/>
-              <w:jc w:val="center"/>
-            </w:pPr>
-            <w:r>
-              <w:rPr>
-                <w:color w:val="1A1A1A"/>
-                <w:sz w:val="20"/>
-              </w:rPr>
-              <w:t>251</w:t>
-            </w:r>
-          </w:p>
-        </w:tc>
-        <w:tc>
-          <w:tcPr>
-            <w:vAlign w:val="center"/>
-          </w:tcPr>
-          <w:p>
-            <w:pPr>
-              <w:spacing w:before="0" w:after="0"/>
-              <w:jc w:val="center"/>
-            </w:pPr>
-            <w:r>
-              <w:rPr>
-                <w:color w:val="1A1A1A"/>
-                <w:sz w:val="20"/>
-              </w:rPr>
-              <w:t>51.5%</w:t>
+              <w:t>✅ Correct Response — Empathetic, specific, actionable</w:t>
+            </w:r>
+          </w:p>
+        </w:tc>
+        <w:tc>
+          <w:tcPr>
+            <w:vAlign w:val="center"/>
+          </w:tcPr>
+          <w:p>
+            <w:pPr>
+              <w:spacing w:before="0" w:after="0"/>
+              <w:jc w:val="center"/>
+            </w:pPr>
+            <w:r>
+              <w:rPr>
+                <w:color w:val="1A1A1A"/>
+                <w:sz w:val="20"/>
+              </w:rPr>
+              <w:t>341</w:t>
+            </w:r>
+          </w:p>
+        </w:tc>
+        <w:tc>
+          <w:tcPr>
+            <w:vAlign w:val="center"/>
+          </w:tcPr>
+          <w:p>
+            <w:pPr>
+              <w:spacing w:before="0" w:after="0"/>
+              <w:jc w:val="center"/>
+            </w:pPr>
+            <w:r>
+              <w:rPr>
+                <w:color w:val="1A1A1A"/>
+                <w:sz w:val="20"/>
+              </w:rPr>
+              <w:t>70.0%</w:t>
             </w:r>
           </w:p>
         </w:tc>
@@ -1582,43 +1582,43 @@
                 <w:color w:val="1A1A1A"/>
                 <w:sz w:val="20"/>
               </w:rPr>
-              <w:t>Responses with an actual solution, steps, or specific guidance</w:t>
-            </w:r>
-          </w:p>
-        </w:tc>
-        <w:tc>
-          <w:tcPr>
-            <w:vAlign w:val="center"/>
-          </w:tcPr>
-          <w:p>
-            <w:pPr>
-              <w:spacing w:before="0" w:after="0"/>
-              <w:jc w:val="center"/>
-            </w:pPr>
-            <w:r>
-              <w:rPr>
-                <w:color w:val="1A1A1A"/>
-                <w:sz w:val="20"/>
-              </w:rPr>
-              <w:t>224</w:t>
-            </w:r>
-          </w:p>
-        </w:tc>
-        <w:tc>
-          <w:tcPr>
-            <w:vAlign w:val="center"/>
-          </w:tcPr>
-          <w:p>
-            <w:pPr>
-              <w:spacing w:before="0" w:after="0"/>
-              <w:jc w:val="center"/>
-            </w:pPr>
-            <w:r>
-              <w:rPr>
-                <w:color w:val="1A1A1A"/>
-                <w:sz w:val="20"/>
-              </w:rPr>
-              <w:t>46.0%</w:t>
+              <w:t>🟡 No Solution — Empathy expressed but no actionable steps given</w:t>
+            </w:r>
+          </w:p>
+        </w:tc>
+        <w:tc>
+          <w:tcPr>
+            <w:vAlign w:val="center"/>
+          </w:tcPr>
+          <w:p>
+            <w:pPr>
+              <w:spacing w:before="0" w:after="0"/>
+              <w:jc w:val="center"/>
+            </w:pPr>
+            <w:r>
+              <w:rPr>
+                <w:color w:val="1A1A1A"/>
+                <w:sz w:val="20"/>
+              </w:rPr>
+              <w:t>73</w:t>
+            </w:r>
+          </w:p>
+        </w:tc>
+        <w:tc>
+          <w:tcPr>
+            <w:vAlign w:val="center"/>
+          </w:tcPr>
+          <w:p>
+            <w:pPr>
+              <w:spacing w:before="0" w:after="0"/>
+              <w:jc w:val="center"/>
+            </w:pPr>
+            <w:r>
+              <w:rPr>
+                <w:color w:val="1A1A1A"/>
+                <w:sz w:val="20"/>
+              </w:rPr>
+              <w:t>15.0%</w:t>
             </w:r>
           </w:p>
         </w:tc>
@@ -1638,43 +1638,267 @@
                 <w:color w:val="1A1A1A"/>
                 <w:sz w:val="20"/>
               </w:rPr>
-              <w:t>Acknowledgment only no URL, no solution</w:t>
-            </w:r>
-          </w:p>
-        </w:tc>
-        <w:tc>
-          <w:tcPr>
-            <w:vAlign w:val="center"/>
-          </w:tcPr>
-          <w:p>
-            <w:pPr>
-              <w:spacing w:before="0" w:after="0"/>
-              <w:jc w:val="center"/>
-            </w:pPr>
-            <w:r>
-              <w:rPr>
-                <w:color w:val="1A1A1A"/>
-                <w:sz w:val="20"/>
-              </w:rPr>
-              <w:t>12</w:t>
-            </w:r>
-          </w:p>
-        </w:tc>
-        <w:tc>
-          <w:tcPr>
-            <w:vAlign w:val="center"/>
-          </w:tcPr>
-          <w:p>
-            <w:pPr>
-              <w:spacing w:before="0" w:after="0"/>
-              <w:jc w:val="center"/>
-            </w:pPr>
-            <w:r>
-              <w:rPr>
-                <w:color w:val="1A1A1A"/>
-                <w:sz w:val="20"/>
-              </w:rPr>
-              <w:t>2.5%</w:t>
+              <w:t>🟡 Generic Template — Boilerplate copy-paste, no specific content</w:t>
+            </w:r>
+          </w:p>
+        </w:tc>
+        <w:tc>
+          <w:tcPr>
+            <w:vAlign w:val="center"/>
+          </w:tcPr>
+          <w:p>
+            <w:pPr>
+              <w:spacing w:before="0" w:after="0"/>
+              <w:jc w:val="center"/>
+            </w:pPr>
+            <w:r>
+              <w:rPr>
+                <w:color w:val="1A1A1A"/>
+                <w:sz w:val="20"/>
+              </w:rPr>
+              <w:t>50</w:t>
+            </w:r>
+          </w:p>
+        </w:tc>
+        <w:tc>
+          <w:tcPr>
+            <w:vAlign w:val="center"/>
+          </w:tcPr>
+          <w:p>
+            <w:pPr>
+              <w:spacing w:before="0" w:after="0"/>
+              <w:jc w:val="center"/>
+            </w:pPr>
+            <w:r>
+              <w:rPr>
+                <w:color w:val="1A1A1A"/>
+                <w:sz w:val="20"/>
+              </w:rPr>
+              <w:t>10.3%</w:t>
+            </w:r>
+          </w:p>
+        </w:tc>
+      </w:tr>
+      <w:tr>
+        <w:tc>
+          <w:tcPr>
+            <w:vAlign w:val="center"/>
+          </w:tcPr>
+          <w:p>
+            <w:pPr>
+              <w:spacing w:before="0" w:after="0"/>
+              <w:jc w:val="left"/>
+            </w:pPr>
+            <w:r>
+              <w:rPr>
+                <w:color w:val="1A1A1A"/>
+                <w:sz w:val="20"/>
+              </w:rPr>
+              <w:t>🔴 Wrong Issue — Reply misses the actual topic raised</w:t>
+            </w:r>
+          </w:p>
+        </w:tc>
+        <w:tc>
+          <w:tcPr>
+            <w:vAlign w:val="center"/>
+          </w:tcPr>
+          <w:p>
+            <w:pPr>
+              <w:spacing w:before="0" w:after="0"/>
+              <w:jc w:val="center"/>
+            </w:pPr>
+            <w:r>
+              <w:rPr>
+                <w:color w:val="1A1A1A"/>
+                <w:sz w:val="20"/>
+              </w:rPr>
+              <w:t>11</w:t>
+            </w:r>
+          </w:p>
+        </w:tc>
+        <w:tc>
+          <w:tcPr>
+            <w:vAlign w:val="center"/>
+          </w:tcPr>
+          <w:p>
+            <w:pPr>
+              <w:spacing w:before="0" w:after="0"/>
+              <w:jc w:val="center"/>
+            </w:pPr>
+            <w:r>
+              <w:rPr>
+                <w:color w:val="1A1A1A"/>
+                <w:sz w:val="20"/>
+              </w:rPr>
+              <w:t>2.3%</w:t>
+            </w:r>
+          </w:p>
+        </w:tc>
+      </w:tr>
+      <w:tr>
+        <w:tc>
+          <w:tcPr>
+            <w:vAlign w:val="center"/>
+          </w:tcPr>
+          <w:p>
+            <w:pPr>
+              <w:spacing w:before="0" w:after="0"/>
+              <w:jc w:val="left"/>
+            </w:pPr>
+            <w:r>
+              <w:rPr>
+                <w:color w:val="1A1A1A"/>
+                <w:sz w:val="20"/>
+              </w:rPr>
+              <w:t>🔴 No Empathy — Upset customer (1-2★) got cold, robotic reply</w:t>
+            </w:r>
+          </w:p>
+        </w:tc>
+        <w:tc>
+          <w:tcPr>
+            <w:vAlign w:val="center"/>
+          </w:tcPr>
+          <w:p>
+            <w:pPr>
+              <w:spacing w:before="0" w:after="0"/>
+              <w:jc w:val="center"/>
+            </w:pPr>
+            <w:r>
+              <w:rPr>
+                <w:color w:val="1A1A1A"/>
+                <w:sz w:val="20"/>
+              </w:rPr>
+              <w:t>6</w:t>
+            </w:r>
+          </w:p>
+        </w:tc>
+        <w:tc>
+          <w:tcPr>
+            <w:vAlign w:val="center"/>
+          </w:tcPr>
+          <w:p>
+            <w:pPr>
+              <w:spacing w:before="0" w:after="0"/>
+              <w:jc w:val="center"/>
+            </w:pPr>
+            <w:r>
+              <w:rPr>
+                <w:color w:val="1A1A1A"/>
+                <w:sz w:val="20"/>
+              </w:rPr>
+              <w:t>1.2%</w:t>
+            </w:r>
+          </w:p>
+        </w:tc>
+      </w:tr>
+      <w:tr>
+        <w:tc>
+          <w:tcPr>
+            <w:vAlign w:val="center"/>
+          </w:tcPr>
+          <w:p>
+            <w:pPr>
+              <w:spacing w:before="0" w:after="0"/>
+              <w:jc w:val="left"/>
+            </w:pPr>
+            <w:r>
+              <w:rPr>
+                <w:color w:val="1A1A1A"/>
+                <w:sz w:val="20"/>
+              </w:rPr>
+              <w:t>🔵 High Rating + Apology — Positive review received unnecessary apology</w:t>
+            </w:r>
+          </w:p>
+        </w:tc>
+        <w:tc>
+          <w:tcPr>
+            <w:vAlign w:val="center"/>
+          </w:tcPr>
+          <w:p>
+            <w:pPr>
+              <w:spacing w:before="0" w:after="0"/>
+              <w:jc w:val="center"/>
+            </w:pPr>
+            <w:r>
+              <w:rPr>
+                <w:color w:val="1A1A1A"/>
+                <w:sz w:val="20"/>
+              </w:rPr>
+              <w:t>5</w:t>
+            </w:r>
+          </w:p>
+        </w:tc>
+        <w:tc>
+          <w:tcPr>
+            <w:vAlign w:val="center"/>
+          </w:tcPr>
+          <w:p>
+            <w:pPr>
+              <w:spacing w:before="0" w:after="0"/>
+              <w:jc w:val="center"/>
+            </w:pPr>
+            <w:r>
+              <w:rPr>
+                <w:color w:val="1A1A1A"/>
+                <w:sz w:val="20"/>
+              </w:rPr>
+              <w:t>1.0%</w:t>
+            </w:r>
+          </w:p>
+        </w:tc>
+      </w:tr>
+      <w:tr>
+        <w:tc>
+          <w:tcPr>
+            <w:vAlign w:val="center"/>
+          </w:tcPr>
+          <w:p>
+            <w:pPr>
+              <w:spacing w:before="0" w:after="0"/>
+              <w:jc w:val="left"/>
+            </w:pPr>
+            <w:r>
+              <w:rPr>
+                <w:color w:val="1A1A1A"/>
+                <w:sz w:val="20"/>
+              </w:rPr>
+              <w:t>🟠 Unwarranted Apology — Neutral statement apologised for unnecessarily</w:t>
+            </w:r>
+          </w:p>
+        </w:tc>
+        <w:tc>
+          <w:tcPr>
+            <w:vAlign w:val="center"/>
+          </w:tcPr>
+          <w:p>
+            <w:pPr>
+              <w:spacing w:before="0" w:after="0"/>
+              <w:jc w:val="center"/>
+            </w:pPr>
+            <w:r>
+              <w:rPr>
+                <w:color w:val="1A1A1A"/>
+                <w:sz w:val="20"/>
+              </w:rPr>
+              <w:t>1</w:t>
+            </w:r>
+          </w:p>
+        </w:tc>
+        <w:tc>
+          <w:tcPr>
+            <w:vAlign w:val="center"/>
+          </w:tcPr>
+          <w:p>
+            <w:pPr>
+              <w:spacing w:before="0" w:after="0"/>
+              <w:jc w:val="center"/>
+            </w:pPr>
+            <w:r>
+              <w:rPr>
+                <w:color w:val="1A1A1A"/>
+                <w:sz w:val="20"/>
+              </w:rPr>
+              <w:t>0.2%</w:t>
             </w:r>
           </w:p>
         </w:tc>
@@ -1685,7 +1909,7 @@
         <w:pStyle w:val="Caption"/>
       </w:pPr>
       <w:r>
-        <w:t>Table 3: Support Response Type Distribution</w:t>
+        <w:t>Table 3: LLM-Evaluated Response Quality Distribution (n=487 responded reviews, March 2026)</w:t>
       </w:r>
     </w:p>
     <w:p>
@@ -1740,7 +1964,7 @@
     </w:p>
     <w:p>
       <w:r>
-        <w:t>More than half of all public responses do nothing more than apologise and link to a support page. To a prospective customer reading the review thread, this looks like a company that does not know how to help its own users. It does not build confidence.</w:t>
+        <w:t>LLM-based evaluation of every individual reply (n=487) reveals that 70% are rated “Correct” — but 30% (146 replies) have meaningful quality gaps. The most common failure: showing empathy but then stopping short of giving the customer a single actionable next step (15%). A further 10.3% are copy-paste boilerplate that do not reference the customer’s specific concern. To a prospective customer reading the review thread, a generic redirect response looks like a company that does not know how to help its own users. It does not build confidence.</w:t>
       </w:r>
     </w:p>
     <w:p>
@@ -2480,7 +2704,7 @@
         <w:rPr>
           <w:sz w:val="21"/>
         </w:rPr>
-        <w:t>51.5% of all responses are redirect-only. Every response template should be audited and expanded with in-reply guidance.</w:t>
+        <w:t>LLM-based evaluation of all 487 replied reviews reveals 30% have quality issues: 15.0% offer empathy but no actionable steps (No Solution), 10.3% are copy-paste boilerplate (Generic Template), and 2.3% address the wrong topic entirely (Wrong Issue). Every response template must be audited and replaced with issue-specific, in-reply guidance.</w:t>
       </w:r>
     </w:p>
     <w:p>
@@ -3576,25 +3800,25 @@
                 <w:color w:val="1A1A1A"/>
                 <w:sz w:val="20"/>
               </w:rPr>
-              <w:t>% responses with in-reply actionable guidance</w:t>
-            </w:r>
-          </w:p>
-        </w:tc>
-        <w:tc>
-          <w:tcPr>
-            <w:vAlign w:val="center"/>
-          </w:tcPr>
-          <w:p>
-            <w:pPr>
-              <w:spacing w:before="0" w:after="0"/>
-              <w:jc w:val="center"/>
-            </w:pPr>
-            <w:r>
-              <w:rPr>
-                <w:color w:val="1A1A1A"/>
-                <w:sz w:val="20"/>
-              </w:rPr>
-              <w:t>46%</w:t>
+              <w:t>% responses rated “Correct” (LLM-evaluated)</w:t>
+            </w:r>
+          </w:p>
+        </w:tc>
+        <w:tc>
+          <w:tcPr>
+            <w:vAlign w:val="center"/>
+          </w:tcPr>
+          <w:p>
+            <w:pPr>
+              <w:spacing w:before="0" w:after="0"/>
+              <w:jc w:val="center"/>
+            </w:pPr>
+            <w:r>
+              <w:rPr>
+                <w:color w:val="1A1A1A"/>
+                <w:sz w:val="20"/>
+              </w:rPr>
+              <w:t>70.0%</w:t>
             </w:r>
           </w:p>
         </w:tc>

</xml_diff>